<commit_message>
2 Interviews + Pending MAB 13-12
</commit_message>
<xml_diff>
--- a/Efraim Taranto - Resume.docx
+++ b/Efraim Taranto - Resume.docx
@@ -397,13 +397,8 @@
       <w:r>
         <w:t xml:space="preserve">and </w:t>
       </w:r>
-      <w:proofErr w:type="spellStart"/>
-      <w:r>
-        <w:t>Snyk</w:t>
-      </w:r>
-      <w:proofErr w:type="spellEnd"/>
-      <w:r>
-        <w:t xml:space="preserve"> compliance</w:t>
+      <w:r>
+        <w:t>Snyk compliance</w:t>
       </w:r>
       <w:r>
         <w:t xml:space="preserve"> checks.</w:t>
@@ -572,15 +567,7 @@
         <w:t>retention</w:t>
       </w:r>
       <w:r>
-        <w:t xml:space="preserve">, </w:t>
-      </w:r>
-      <w:proofErr w:type="spellStart"/>
-      <w:r>
-        <w:t>Agentforce</w:t>
-      </w:r>
-      <w:proofErr w:type="spellEnd"/>
-      <w:r>
-        <w:t xml:space="preserve"> for </w:t>
+        <w:t xml:space="preserve">, Agentforce for </w:t>
       </w:r>
       <w:r>
         <w:t>field sales</w:t>
@@ -672,15 +659,7 @@
         <w:t xml:space="preserve"> based on </w:t>
       </w:r>
       <w:r>
-        <w:t xml:space="preserve">SFMC </w:t>
-      </w:r>
-      <w:proofErr w:type="spellStart"/>
-      <w:r>
-        <w:t>DevTools</w:t>
-      </w:r>
-      <w:proofErr w:type="spellEnd"/>
-      <w:r>
-        <w:t xml:space="preserve"> (mcdev)</w:t>
+        <w:t>SFMC DevTools (mcdev)</w:t>
       </w:r>
       <w:r>
         <w:t>.</w:t>
@@ -929,13 +908,8 @@
         <w:t>scaled it</w:t>
       </w:r>
       <w:r>
-        <w:t xml:space="preserve"> to 50,000 concurrent connections using </w:t>
-      </w:r>
-      <w:proofErr w:type="spellStart"/>
-      <w:r>
-        <w:t>BlazeMeter</w:t>
-      </w:r>
-      <w:proofErr w:type="spellEnd"/>
+        <w:t xml:space="preserve"> to 50,000 concurrent connections using BlazeMeter</w:t>
+      </w:r>
       <w:r>
         <w:t>, validating</w:t>
       </w:r>
@@ -1169,15 +1143,7 @@
         <w:t xml:space="preserve"> and </w:t>
       </w:r>
       <w:r>
-        <w:t xml:space="preserve">integrated with HP Quality </w:t>
-      </w:r>
-      <w:proofErr w:type="spellStart"/>
-      <w:r>
-        <w:t>Center</w:t>
-      </w:r>
-      <w:proofErr w:type="spellEnd"/>
-      <w:r>
-        <w:t xml:space="preserve"> to execute </w:t>
+        <w:t xml:space="preserve">integrated with HP Quality Center to execute </w:t>
       </w:r>
       <w:r>
         <w:t xml:space="preserve">tests </w:t>
@@ -1209,13 +1175,8 @@
       <w:r>
         <w:t xml:space="preserve"> SAP IS/U, </w:t>
       </w:r>
-      <w:proofErr w:type="spellStart"/>
-      <w:r>
-        <w:t>WebMethods</w:t>
-      </w:r>
-      <w:proofErr w:type="spellEnd"/>
-      <w:r>
-        <w:t>,</w:t>
+      <w:r>
+        <w:t>WebMethods,</w:t>
       </w:r>
       <w:r>
         <w:t xml:space="preserve"> and Energy Gateway. </w:t>
@@ -1249,23 +1210,7 @@
         <w:spacing w:after="0"/>
       </w:pPr>
       <w:r>
-        <w:t xml:space="preserve">Using the defined testing framework, engineered an enterprise test reporting mechanism by customising HP Quality </w:t>
-      </w:r>
-      <w:proofErr w:type="spellStart"/>
-      <w:r>
-        <w:t>Center</w:t>
-      </w:r>
-      <w:proofErr w:type="spellEnd"/>
-      <w:r>
-        <w:t xml:space="preserve"> and integrating HP Quality </w:t>
-      </w:r>
-      <w:proofErr w:type="spellStart"/>
-      <w:r>
-        <w:t>Center</w:t>
-      </w:r>
-      <w:proofErr w:type="spellEnd"/>
-      <w:r>
-        <w:t xml:space="preserve"> and Microsoft APIs. The mechanism provided a daily testing progress dashboard that collected manual and automated testing results as well as defect tracking, giving internal and vendor project managers a real-time view to support program testing gates.</w:t>
+        <w:t>Using the defined testing framework, engineered an enterprise test reporting mechanism by customising HP Quality Center and integrating HP Quality Center and Microsoft APIs. The mechanism provided a daily testing progress dashboard that collected manual and automated testing results as well as defect tracking, giving internal and vendor project managers a real-time view to support program testing gates.</w:t>
       </w:r>
     </w:p>
     <w:p>
@@ -1290,15 +1235,7 @@
         <w:t xml:space="preserve">the </w:t>
       </w:r>
       <w:r>
-        <w:t xml:space="preserve">HP Quality </w:t>
-      </w:r>
-      <w:proofErr w:type="spellStart"/>
-      <w:r>
-        <w:t>Center</w:t>
-      </w:r>
-      <w:proofErr w:type="spellEnd"/>
-      <w:r>
-        <w:t xml:space="preserve"> foundation </w:t>
+        <w:t xml:space="preserve">HP Quality Center foundation </w:t>
       </w:r>
       <w:r>
         <w:t>structure of releases</w:t>
@@ -1334,13 +1271,8 @@
       <w:r>
         <w:t xml:space="preserve">Built automated reporting tools that consolidated data from Microsoft Project, Microsoft Excel, HP Quality </w:t>
       </w:r>
-      <w:proofErr w:type="spellStart"/>
-      <w:r>
-        <w:t>Center</w:t>
-      </w:r>
-      <w:proofErr w:type="spellEnd"/>
-      <w:r>
-        <w:t>,</w:t>
+      <w:r>
+        <w:t>Center,</w:t>
       </w:r>
       <w:r>
         <w:t xml:space="preserve"> and Jira to produce daily development and testing progress reports</w:t>
@@ -1454,15 +1386,7 @@
         </w:rPr>
       </w:pPr>
       <w:r>
-        <w:t xml:space="preserve">Delivered HP Quality </w:t>
-      </w:r>
-      <w:proofErr w:type="spellStart"/>
-      <w:r>
-        <w:t>Center</w:t>
-      </w:r>
-      <w:proofErr w:type="spellEnd"/>
-      <w:r>
-        <w:t xml:space="preserve"> and HP UFT training to testing teams across multiple Revolution IT clients, strengthening their capability to use the tools effectively.</w:t>
+        <w:t>Delivered HP Quality Center and HP UFT training to testing teams across multiple Revolution IT clients, strengthening their capability to use the tools effectively.</w:t>
       </w:r>
     </w:p>
     <w:p>
@@ -1501,7 +1425,13 @@
         <w:t xml:space="preserve"> | </w:t>
       </w:r>
       <w:r>
-        <w:t>Jane 2005</w:t>
+        <w:t>J</w:t>
+      </w:r>
+      <w:r>
+        <w:t>u</w:t>
+      </w:r>
+      <w:r>
+        <w:t>ne 2005</w:t>
       </w:r>
       <w:r>
         <w:t xml:space="preserve"> </w:t>
@@ -1528,15 +1458,7 @@
         <w:t>/</w:t>
       </w:r>
       <w:r>
-        <w:t xml:space="preserve">U, the custom-developed tolling system, and the </w:t>
-      </w:r>
-      <w:proofErr w:type="spellStart"/>
-      <w:r>
-        <w:t>EastLink</w:t>
-      </w:r>
-      <w:proofErr w:type="spellEnd"/>
-      <w:r>
-        <w:t xml:space="preserve"> web portal.</w:t>
+        <w:t>U, the custom-developed tolling system, and the EastLink web portal.</w:t>
       </w:r>
     </w:p>
     <w:p>
@@ -1640,39 +1562,7 @@
         <w:spacing w:after="0"/>
       </w:pPr>
       <w:r>
-        <w:t xml:space="preserve">Led technical and functional consulting for </w:t>
-      </w:r>
-      <w:proofErr w:type="spellStart"/>
-      <w:r>
-        <w:t>Quanam</w:t>
-      </w:r>
-      <w:proofErr w:type="spellEnd"/>
-      <w:r>
-        <w:t xml:space="preserve"> PeopleSoft implementations across ERP, CRM, inventory, order management, and project costing, integrating PeopleSoft and </w:t>
-      </w:r>
-      <w:proofErr w:type="spellStart"/>
-      <w:r>
-        <w:t>Vantive</w:t>
-      </w:r>
-      <w:proofErr w:type="spellEnd"/>
-      <w:r>
-        <w:t xml:space="preserve"> with legacy systems using IBM MQSeries and customising solutions with </w:t>
-      </w:r>
-      <w:proofErr w:type="spellStart"/>
-      <w:r>
-        <w:t>PeopleCode</w:t>
-      </w:r>
-      <w:proofErr w:type="spellEnd"/>
-      <w:r>
-        <w:t xml:space="preserve">, SQR, Application Engine, and </w:t>
-      </w:r>
-      <w:proofErr w:type="spellStart"/>
-      <w:r>
-        <w:t>nVision</w:t>
-      </w:r>
-      <w:proofErr w:type="spellEnd"/>
-      <w:r>
-        <w:t>.</w:t>
+        <w:t>Led technical and functional consulting for Quanam PeopleSoft implementations across ERP, CRM, inventory, order management, and project costing, integrating PeopleSoft and Vantive with legacy systems using IBM MQSeries and customising solutions with PeopleCode, SQR, Application Engine, and nVision.</w:t>
       </w:r>
     </w:p>
     <w:p>
@@ -2003,23 +1893,7 @@
           <w:b/>
           <w:bCs/>
         </w:rPr>
-        <w:t xml:space="preserve">Universidad </w:t>
-      </w:r>
-      <w:proofErr w:type="spellStart"/>
-      <w:r>
-        <w:rPr>
-          <w:b/>
-          <w:bCs/>
-        </w:rPr>
-        <w:t>Metropolitana</w:t>
-      </w:r>
-      <w:proofErr w:type="spellEnd"/>
-      <w:r>
-        <w:rPr>
-          <w:b/>
-          <w:bCs/>
-        </w:rPr>
-        <w:t>, Venezuela</w:t>
+        <w:t>Universidad Metropolitana, Venezuela</w:t>
       </w:r>
       <w:r>
         <w:t xml:space="preserve"> | 1990–1995</w:t>
@@ -5168,6 +5042,7 @@
   <w:style w:type="character" w:default="1" w:styleId="DefaultParagraphFont">
     <w:name w:val="Default Paragraph Font"/>
     <w:uiPriority w:val="1"/>
+    <w:semiHidden/>
     <w:unhideWhenUsed/>
   </w:style>
   <w:style w:type="table" w:default="1" w:styleId="TableNormal">

</xml_diff>